<commit_message>
fixed typo in ISUP howto
</commit_message>
<xml_diff>
--- a/docs/How to configure ISUP in Yate.docx
+++ b/docs/How to configure ISUP in Yate.docx
@@ -267,7 +267,6 @@
         <w:rPr>
           <w:lang w:val="en"/>
         </w:rPr>
-        <w:lastRenderedPageBreak/>
         <w:t xml:space="preserve">ISUP </w:t>
       </w:r>
       <w:r>
@@ -762,7 +761,6 @@
         <w:rPr>
           <w:lang w:val="en"/>
         </w:rPr>
-        <w:lastRenderedPageBreak/>
         <w:t>ignore-</w:t>
       </w:r>
       <w:proofErr w:type="spellStart"/>
@@ -1276,7 +1274,6 @@
           <w:rFonts w:ascii="Consolas" w:hAnsi="Consolas"/>
           <w:lang w:val="en"/>
         </w:rPr>
-        <w:lastRenderedPageBreak/>
         <w:t>;Primary</w:t>
       </w:r>
       <w:proofErr w:type="gramEnd"/>
@@ -1978,7 +1975,6 @@
           <w:bCs/>
           <w:lang w:val="en"/>
         </w:rPr>
-        <w:lastRenderedPageBreak/>
         <w:t>netindicator</w:t>
       </w:r>
       <w:proofErr w:type="spellEnd"/>
@@ -2260,16 +2256,7 @@
           <w:bCs/>
           <w:lang w:val="en"/>
         </w:rPr>
-        <w:t>user=ACgw10</w:t>
-      </w:r>
-      <w:r>
-        <w:rPr>
-          <w:rFonts w:ascii="Consolas" w:hAnsi="Consolas"/>
-          <w:b/>
-          <w:bCs/>
-          <w:lang w:val="en"/>
-        </w:rPr>
-        <w:t>0</w:t>
+        <w:t>user=ACgw100</w:t>
       </w:r>
     </w:p>
     <w:p>
@@ -2588,7 +2575,6 @@
           <w:rFonts w:ascii="Consolas" w:hAnsi="Consolas"/>
           <w:lang w:val="en"/>
         </w:rPr>
-        <w:lastRenderedPageBreak/>
         <w:t>[sctp-m2pa]</w:t>
       </w:r>
     </w:p>
@@ -3109,7 +3095,6 @@
         <w:rPr>
           <w:lang w:val="en"/>
         </w:rPr>
-        <w:lastRenderedPageBreak/>
         <w:t>Voice it is set in:</w:t>
       </w:r>
     </w:p>
@@ -3219,14 +3204,7 @@
           <w:rFonts w:ascii="Consolas" w:hAnsi="Consolas"/>
           <w:lang w:val="en"/>
         </w:rPr>
-        <w:t>0</w:t>
-      </w:r>
-      <w:r>
-        <w:rPr>
-          <w:rFonts w:ascii="Consolas" w:hAnsi="Consolas"/>
-          <w:lang w:val="en"/>
-        </w:rPr>
-        <w:t>0</w:t>
+        <w:t>00</w:t>
       </w:r>
     </w:p>
     <w:p>
@@ -3659,7 +3637,6 @@
           <w:rFonts w:ascii="Consolas" w:hAnsi="Consolas"/>
           <w:lang w:val="en"/>
         </w:rPr>
-        <w:lastRenderedPageBreak/>
         <w:t>address=0.0.0.0</w:t>
       </w:r>
     </w:p>
@@ -3885,7 +3862,49 @@
           <w:rFonts w:ascii="Consolas" w:hAnsi="Consolas"/>
           <w:lang w:val="en"/>
         </w:rPr>
-        <w:t>[ep ACgw101]</w:t>
+        <w:t>[ep A</w:t>
+      </w:r>
+      <w:r>
+        <w:rPr>
+          <w:rFonts w:ascii="Consolas" w:hAnsi="Consolas"/>
+          <w:lang w:val="en"/>
+        </w:rPr>
+        <w:t>c</w:t>
+      </w:r>
+      <w:r>
+        <w:rPr>
+          <w:rFonts w:ascii="Consolas" w:hAnsi="Consolas"/>
+          <w:lang w:val="en"/>
+        </w:rPr>
+        <w:t>gw</w:t>
+      </w:r>
+      <w:r>
+        <w:rPr>
+          <w:rFonts w:ascii="Consolas" w:hAnsi="Consolas"/>
+          <w:lang w:val="en"/>
+        </w:rPr>
+        <w:t>2</w:t>
+      </w:r>
+      <w:r>
+        <w:rPr>
+          <w:rFonts w:ascii="Consolas" w:hAnsi="Consolas"/>
+          <w:lang w:val="en"/>
+        </w:rPr>
+        <w:t>0</w:t>
+      </w:r>
+      <w:r>
+        <w:rPr>
+          <w:rFonts w:ascii="Consolas" w:hAnsi="Consolas"/>
+          <w:lang w:val="en"/>
+        </w:rPr>
+        <w:t>0</w:t>
+      </w:r>
+      <w:r>
+        <w:rPr>
+          <w:rFonts w:ascii="Consolas" w:hAnsi="Consolas"/>
+          <w:lang w:val="en"/>
+        </w:rPr>
+        <w:t>]</w:t>
       </w:r>
     </w:p>
     <w:p>
@@ -5644,6 +5663,7 @@
   <w:style w:type="character" w:default="1" w:styleId="DefaultParagraphFont">
     <w:name w:val="Default Paragraph Font"/>
     <w:uiPriority w:val="1"/>
+    <w:semiHidden/>
     <w:unhideWhenUsed/>
   </w:style>
   <w:style w:type="table" w:default="1" w:styleId="TableNormal">

</xml_diff>